<commit_message>
fix phone screenshot in feedback doc
The earlier phone capture was taken at a 500px layout cropped to 375px.
Replaced with a true 375px viewport capture. No student code is modified.

Co-Authored-By: Claude Fable 5.1 <noreply@anthropic.com>
</commit_message>
<xml_diff>
--- a/feedback/Hamzah-Marie-Project-1-Feedback.docx
+++ b/feedback/Hamzah-Marie-Project-1-Feedback.docx
@@ -74,7 +74,7 @@
         </w:rPr>
         <w:t xml:space="preserve">Repo: </w:t>
       </w:r>
-      <w:hyperlink w:history="1" r:id="rIdf97zcwdx3f5nvl8vzy6cp">
+      <w:hyperlink w:history="1" r:id="rIdzmf3jni_e3lfsqq8wl-ls">
         <w:r>
           <w:rPr>
             <w:rStyle w:val="Hyperlink"/>
@@ -92,7 +92,7 @@
         </w:rPr>
         <w:t xml:space="preserve">Live: </w:t>
       </w:r>
-      <w:hyperlink w:history="1" r:id="rIdkdfqsanls9ry2uptd25je">
+      <w:hyperlink w:history="1" r:id="rIdenlg3ucqh6gmtclan7nfv">
         <w:r>
           <w:rPr>
             <w:rStyle w:val="Hyperlink"/>

</xml_diff>